<commit_message>
Update site content and footer contact links
</commit_message>
<xml_diff>
--- a/WebFeria.docx
+++ b/WebFeria.docx
@@ -101,264 +101,12 @@
     </w:p>
     <w:p>
       <w:pPr>
-        <w:ind w:left="708"/>
-        <w:rPr>
-          <w:rFonts w:ascii="Times New Roman" w:hAnsi="Times New Roman" w:cs="Times New Roman"/>
-        </w:rPr>
-      </w:pPr>
-      <w:r>
-        <w:rPr>
-          <w:rFonts w:ascii="Times New Roman" w:hAnsi="Times New Roman" w:cs="Times New Roman"/>
-        </w:rPr>
-        <w:t xml:space="preserve">“A todos los artesanos y a todos aquellos que sientan la necesidad de asumir el compromiso de crecimiento individual y colectivo, en defensa de los intereses comunes” </w:t>
-      </w:r>
-    </w:p>
-    <w:p>
-      <w:pPr>
-        <w:ind w:left="708"/>
-        <w:jc w:val="right"/>
-        <w:rPr>
-          <w:rFonts w:ascii="Times New Roman" w:hAnsi="Times New Roman" w:cs="Times New Roman"/>
-        </w:rPr>
-      </w:pPr>
-      <w:r>
-        <w:rPr>
-          <w:rFonts w:ascii="Times New Roman" w:hAnsi="Times New Roman" w:cs="Times New Roman"/>
-        </w:rPr>
-        <w:t>Acta constitutiva, 20 de febrero, 2010</w:t>
-      </w:r>
-    </w:p>
-    <w:p>
-      <w:pPr>
         <w:jc w:val="both"/>
-        <w:rPr>
-          <w:rFonts w:ascii="Times New Roman" w:hAnsi="Times New Roman" w:cs="Times New Roman"/>
-        </w:rPr>
-      </w:pPr>
-      <w:r>
-        <w:rPr>
-          <w:rFonts w:ascii="Times New Roman" w:hAnsi="Times New Roman" w:cs="Times New Roman"/>
-        </w:rPr>
-        <w:t xml:space="preserve">Parados en este presente y acudiendo a la memoria, el trayecto realizado es una muestra de que aceptamos enfrentar los desafíos, profundizar la confianza y asumir nuestra condición de trabajadores de la cultura, </w:t>
-      </w:r>
-      <w:r>
-        <w:rPr>
-          <w:rFonts w:ascii="Times New Roman" w:hAnsi="Times New Roman" w:cs="Times New Roman"/>
-        </w:rPr>
-        <w:t xml:space="preserve">buscando el equilibrio entre </w:t>
-      </w:r>
-      <w:r>
-        <w:rPr>
-          <w:rFonts w:ascii="Times New Roman" w:hAnsi="Times New Roman" w:cs="Times New Roman"/>
-        </w:rPr>
-        <w:t>sus</w:t>
-      </w:r>
-      <w:r>
-        <w:rPr>
-          <w:rFonts w:ascii="Times New Roman" w:hAnsi="Times New Roman" w:cs="Times New Roman"/>
-        </w:rPr>
-        <w:t xml:space="preserve"> raíces más profundas y la proyección en nuevas expresiones</w:t>
-      </w:r>
-      <w:r>
-        <w:rPr>
-          <w:rFonts w:ascii="Times New Roman" w:hAnsi="Times New Roman" w:cs="Times New Roman"/>
-        </w:rPr>
-        <w:t xml:space="preserve">; y por sobre todas las cosas, </w:t>
-      </w:r>
-      <w:r>
-        <w:rPr>
-          <w:rFonts w:ascii="Times New Roman" w:hAnsi="Times New Roman" w:cs="Times New Roman"/>
-        </w:rPr>
-        <w:t xml:space="preserve"> </w:t>
-      </w:r>
-      <w:r>
-        <w:rPr>
-          <w:rFonts w:ascii="Times New Roman" w:hAnsi="Times New Roman" w:cs="Times New Roman"/>
-        </w:rPr>
-        <w:t xml:space="preserve">la artesanía no es solo un bien económico, sino un producto que refleja el pensamiento y el sentir de su creador, quien deja de ser anónimo para transformarse en el autor de un bien cultural. </w:t>
-      </w:r>
-    </w:p>
-    <w:p>
-      <w:pPr>
-        <w:jc w:val="both"/>
-        <w:rPr>
-          <w:rFonts w:ascii="Times New Roman" w:hAnsi="Times New Roman" w:cs="Times New Roman"/>
-        </w:rPr>
-      </w:pPr>
-      <w:r>
-        <w:rPr>
-          <w:rFonts w:ascii="Times New Roman" w:hAnsi="Times New Roman" w:cs="Times New Roman"/>
-        </w:rPr>
-        <w:t xml:space="preserve">Nuestra asociación como herramienta de desarrollo social, nos permite ofrecer a la comunidad un lugar para el aprendizaje y asumir el compromiso con las nuevas generaciones, quienes podrán tomar nuestro camino y mejorar la propuesta a partir de nuestra experiencia. </w:t>
-      </w:r>
-    </w:p>
-    <w:p>
-      <w:pPr>
-        <w:rPr>
-          <w:rFonts w:ascii="Times New Roman" w:hAnsi="Times New Roman" w:cs="Times New Roman"/>
-        </w:rPr>
-      </w:pPr>
-      <w:r>
-        <w:rPr>
-          <w:rFonts w:ascii="Times New Roman" w:hAnsi="Times New Roman" w:cs="Times New Roman"/>
-        </w:rPr>
-        <w:t>Video2</w:t>
-      </w:r>
-    </w:p>
-    <w:p>
-      <w:pPr>
-        <w:rPr>
-          <w:rFonts w:ascii="Times New Roman" w:hAnsi="Times New Roman" w:cs="Times New Roman"/>
-        </w:rPr>
-      </w:pPr>
-      <w:r>
-        <w:rPr>
-          <w:rFonts w:ascii="Times New Roman" w:hAnsi="Times New Roman" w:cs="Times New Roman"/>
-        </w:rPr>
-        <w:t xml:space="preserve">Foto3, </w:t>
-      </w:r>
-      <w:r>
-        <w:rPr>
-          <w:rFonts w:ascii="Times New Roman" w:hAnsi="Times New Roman" w:cs="Times New Roman"/>
-        </w:rPr>
-        <w:t>foto4</w:t>
-      </w:r>
-      <w:r>
-        <w:rPr>
-          <w:rFonts w:ascii="Times New Roman" w:hAnsi="Times New Roman" w:cs="Times New Roman"/>
-        </w:rPr>
-        <w:t>, foto5</w:t>
-      </w:r>
-    </w:p>
-    <w:p>
-      <w:pPr>
-        <w:pStyle w:val="Ttulo2"/>
-      </w:pPr>
-      <w:r>
-        <w:t>Nuestra Historia</w:t>
-      </w:r>
-    </w:p>
-    <w:p>
-      <w:pPr>
-        <w:rPr>
-          <w:rFonts w:ascii="Times New Roman" w:hAnsi="Times New Roman" w:cs="Times New Roman"/>
-        </w:rPr>
-      </w:pPr>
-      <w:r>
-        <w:rPr>
-          <w:rFonts w:ascii="Times New Roman" w:hAnsi="Times New Roman" w:cs="Times New Roman"/>
-        </w:rPr>
-        <w:t>Tierra, postes y trabajo colectivo</w:t>
-      </w:r>
-    </w:p>
-    <w:p>
-      <w:pPr>
-        <w:rPr>
-          <w:rFonts w:ascii="Times New Roman" w:hAnsi="Times New Roman" w:cs="Times New Roman"/>
-        </w:rPr>
-      </w:pPr>
-      <w:r>
-        <w:rPr>
-          <w:rFonts w:ascii="Times New Roman" w:hAnsi="Times New Roman" w:cs="Times New Roman"/>
-        </w:rPr>
-        <w:t>Fotos: foto1</w:t>
-      </w:r>
-      <w:r>
-        <w:rPr>
-          <w:rFonts w:ascii="Times New Roman" w:hAnsi="Times New Roman" w:cs="Times New Roman"/>
-        </w:rPr>
-        <w:t xml:space="preserve"> y foto2</w:t>
-      </w:r>
-    </w:p>
-    <w:p>
-      <w:pPr>
-        <w:rPr>
-          <w:rFonts w:ascii="Times New Roman" w:hAnsi="Times New Roman" w:cs="Times New Roman"/>
-        </w:rPr>
-      </w:pPr>
-      <w:r>
-        <w:rPr>
-          <w:rFonts w:ascii="Times New Roman" w:hAnsi="Times New Roman" w:cs="Times New Roman"/>
-        </w:rPr>
-        <w:t>Video3</w:t>
-      </w:r>
-    </w:p>
-    <w:p>
-      <w:pPr>
-        <w:rPr>
-          <w:rFonts w:ascii="Times New Roman" w:hAnsi="Times New Roman" w:cs="Times New Roman"/>
-        </w:rPr>
-      </w:pPr>
-      <w:r>
         <w:rPr>
           <w:rFonts w:ascii="Times New Roman" w:hAnsi="Times New Roman" w:cs="Times New Roman"/>
           <w:b/>
           <w:bCs/>
         </w:rPr>
-        <w:t>Año primero</w:t>
-      </w:r>
-      <w:r>
-        <w:rPr>
-          <w:rFonts w:ascii="Times New Roman" w:hAnsi="Times New Roman" w:cs="Times New Roman"/>
-        </w:rPr>
-        <w:t xml:space="preserve">: </w:t>
-      </w:r>
-      <w:r>
-        <w:rPr>
-          <w:rFonts w:ascii="Times New Roman" w:hAnsi="Times New Roman" w:cs="Times New Roman"/>
-        </w:rPr>
-        <w:t>j</w:t>
-      </w:r>
-      <w:r>
-        <w:rPr>
-          <w:rFonts w:ascii="Times New Roman" w:hAnsi="Times New Roman" w:cs="Times New Roman"/>
-        </w:rPr>
-        <w:t xml:space="preserve">ulio de 2008 </w:t>
-      </w:r>
-      <w:r>
-        <w:rPr>
-          <w:rFonts w:ascii="Times New Roman" w:hAnsi="Times New Roman" w:cs="Times New Roman"/>
-        </w:rPr>
-        <w:t>-</w:t>
-      </w:r>
-      <w:r>
-        <w:rPr>
-          <w:rFonts w:ascii="Times New Roman" w:hAnsi="Times New Roman" w:cs="Times New Roman"/>
-        </w:rPr>
-        <w:t xml:space="preserve"> julio del 2009</w:t>
-      </w:r>
-    </w:p>
-    <w:p>
-      <w:pPr>
-        <w:rPr>
-          <w:rFonts w:ascii="Times New Roman" w:hAnsi="Times New Roman" w:cs="Times New Roman"/>
-        </w:rPr>
-      </w:pPr>
-      <w:r>
-        <w:rPr>
-          <w:rFonts w:ascii="Times New Roman" w:hAnsi="Times New Roman" w:cs="Times New Roman"/>
-        </w:rPr>
-        <w:t>Agosto, 2008: Desfile de prendas artesanales en nuestro predio</w:t>
-      </w:r>
-    </w:p>
-    <w:p>
-      <w:pPr>
-        <w:rPr>
-          <w:rFonts w:ascii="Times New Roman" w:hAnsi="Times New Roman" w:cs="Times New Roman"/>
-        </w:rPr>
-      </w:pPr>
-      <w:r>
-        <w:rPr>
-          <w:rFonts w:ascii="Times New Roman" w:hAnsi="Times New Roman" w:cs="Times New Roman"/>
-        </w:rPr>
-        <w:t>Febrero, 2009: Fiesta de la Vendimia. Finca las Nubes (Cafayate)</w:t>
-      </w:r>
-    </w:p>
-    <w:p>
-      <w:pPr>
-        <w:rPr>
-          <w:rFonts w:ascii="Times New Roman" w:hAnsi="Times New Roman" w:cs="Times New Roman"/>
-        </w:rPr>
       </w:pPr>
       <w:r>
         <w:rPr>
@@ -366,13 +114,218 @@
           <w:b/>
           <w:bCs/>
         </w:rPr>
-        <w:t>Primer Aniversario</w:t>
-      </w:r>
-      <w:r>
-        <w:rPr>
-          <w:rFonts w:ascii="Times New Roman" w:hAnsi="Times New Roman" w:cs="Times New Roman"/>
-        </w:rPr>
-        <w:t>: Julio, 2009</w:t>
+        <w:t>“A todos los artesanos y a todos aquellos que sientan la necesidad de asumir el compromiso de crecimiento individual y colectivo, en defensa de los intereses comunes”</w:t>
+      </w:r>
+    </w:p>
+    <w:p>
+      <w:pPr>
+        <w:jc w:val="right"/>
+        <w:rPr>
+          <w:rFonts w:ascii="Times New Roman" w:hAnsi="Times New Roman" w:cs="Times New Roman"/>
+        </w:rPr>
+      </w:pPr>
+      <w:r>
+        <w:rPr>
+          <w:rFonts w:ascii="Times New Roman" w:hAnsi="Times New Roman" w:cs="Times New Roman"/>
+        </w:rPr>
+        <w:t>Acta constitutiva, 20 de febrero, 2010</w:t>
+      </w:r>
+    </w:p>
+    <w:p>
+      <w:pPr>
+        <w:jc w:val="both"/>
+        <w:rPr>
+          <w:rFonts w:ascii="Times New Roman" w:hAnsi="Times New Roman" w:cs="Times New Roman"/>
+        </w:rPr>
+      </w:pPr>
+      <w:r>
+        <w:rPr>
+          <w:rFonts w:ascii="Times New Roman" w:hAnsi="Times New Roman" w:cs="Times New Roman"/>
+        </w:rPr>
+        <w:t xml:space="preserve">Somos una asociación de artesanos que, desde Cafayate, construye día a día un espacio de trabajo, encuentro y creación colectiva. Nuestro recorrido, forjado con esfuerzo y cooperación, refleja una decisión compartida: frente a la incertidumbre y las transformaciones del mundo en general y el trabajo en particular, la salida es colectiva. Es en comunidad que vamos a lograr construir un espacio de trabajo cada día más digno y hermoso, para nosotros y para las futuras generaciones de artesanos que se vayan sumando a nuestro proyecto para hacerlo suyo también. </w:t>
+      </w:r>
+    </w:p>
+    <w:p>
+      <w:pPr>
+        <w:jc w:val="both"/>
+        <w:rPr>
+          <w:rFonts w:ascii="Times New Roman" w:hAnsi="Times New Roman" w:cs="Times New Roman"/>
+        </w:rPr>
+      </w:pPr>
+      <w:r>
+        <w:rPr>
+          <w:rFonts w:ascii="Times New Roman" w:hAnsi="Times New Roman" w:cs="Times New Roman"/>
+        </w:rPr>
+        <w:t>Entendemos la artesanía como algo más que un medio de sustento. Cada pieza es una expresión singular, un objeto que condensa la historia, el pensamiento y la sensibilidad de quien la crea. En ese proceso, el artesano deja de ser anónimo para convertirse en autor de un bien cultural que dialoga con su comunidad y con su tiempo.</w:t>
+      </w:r>
+    </w:p>
+    <w:p>
+      <w:pPr>
+        <w:jc w:val="both"/>
+        <w:rPr>
+          <w:rFonts w:ascii="Times New Roman" w:hAnsi="Times New Roman" w:cs="Times New Roman"/>
+        </w:rPr>
+      </w:pPr>
+      <w:r>
+        <w:rPr>
+          <w:rFonts w:ascii="Times New Roman" w:hAnsi="Times New Roman" w:cs="Times New Roman"/>
+        </w:rPr>
+        <w:t>Como asociación, nos proponemos ser una herramienta de desarrollo social. Abrimos nuestras puertas al aprendizaje, al intercambio de saberes y al acompañamiento de nuevas generaciones. Creemos en la transmisión de la experiencia como base para que otros continúen, transformen y enriquezcan este camino colectivo.</w:t>
+      </w:r>
+    </w:p>
+    <w:p>
+      <w:pPr>
+        <w:jc w:val="both"/>
+        <w:rPr>
+          <w:rFonts w:ascii="Times New Roman" w:hAnsi="Times New Roman" w:cs="Times New Roman"/>
+        </w:rPr>
+      </w:pPr>
+      <w:proofErr w:type="gramStart"/>
+      <w:r>
+        <w:rPr>
+          <w:rFonts w:ascii="Times New Roman" w:hAnsi="Times New Roman" w:cs="Times New Roman"/>
+        </w:rPr>
+        <w:t>Los esperamos!</w:t>
+      </w:r>
+      <w:proofErr w:type="gramEnd"/>
+    </w:p>
+    <w:p>
+      <w:pPr>
+        <w:rPr>
+          <w:rFonts w:ascii="Times New Roman" w:hAnsi="Times New Roman" w:cs="Times New Roman"/>
+        </w:rPr>
+      </w:pPr>
+      <w:r>
+        <w:rPr>
+          <w:rFonts w:ascii="Times New Roman" w:hAnsi="Times New Roman" w:cs="Times New Roman"/>
+        </w:rPr>
+        <w:t xml:space="preserve">Con cariño: </w:t>
+      </w:r>
+      <w:r>
+        <w:rPr>
+          <w:rFonts w:ascii="Times New Roman" w:hAnsi="Times New Roman" w:cs="Times New Roman"/>
+        </w:rPr>
+        <w:t>Asociación de Artesanos Independientes</w:t>
+      </w:r>
+      <w:r>
+        <w:rPr>
+          <w:rFonts w:ascii="Times New Roman" w:hAnsi="Times New Roman" w:cs="Times New Roman"/>
+        </w:rPr>
+        <w:t xml:space="preserve"> </w:t>
+      </w:r>
+      <w:r>
+        <w:rPr>
+          <w:rFonts w:ascii="Times New Roman" w:hAnsi="Times New Roman" w:cs="Times New Roman"/>
+        </w:rPr>
+        <w:t xml:space="preserve">Cafayate Artesanal </w:t>
+      </w:r>
+    </w:p>
+    <w:p>
+      <w:pPr>
+        <w:jc w:val="both"/>
+        <w:rPr>
+          <w:rFonts w:ascii="Times New Roman" w:hAnsi="Times New Roman" w:cs="Times New Roman"/>
+        </w:rPr>
+      </w:pPr>
+    </w:p>
+    <w:p>
+      <w:pPr>
+        <w:jc w:val="both"/>
+        <w:rPr>
+          <w:rFonts w:ascii="Times New Roman" w:hAnsi="Times New Roman" w:cs="Times New Roman"/>
+        </w:rPr>
+      </w:pPr>
+    </w:p>
+    <w:p>
+      <w:pPr>
+        <w:rPr>
+          <w:rFonts w:ascii="Times New Roman" w:hAnsi="Times New Roman" w:cs="Times New Roman"/>
+        </w:rPr>
+      </w:pPr>
+      <w:r>
+        <w:rPr>
+          <w:rFonts w:ascii="Times New Roman" w:hAnsi="Times New Roman" w:cs="Times New Roman"/>
+        </w:rPr>
+        <w:t>Video2</w:t>
+      </w:r>
+    </w:p>
+    <w:p>
+      <w:pPr>
+        <w:rPr>
+          <w:rFonts w:ascii="Times New Roman" w:hAnsi="Times New Roman" w:cs="Times New Roman"/>
+        </w:rPr>
+      </w:pPr>
+      <w:r>
+        <w:rPr>
+          <w:rFonts w:ascii="Times New Roman" w:hAnsi="Times New Roman" w:cs="Times New Roman"/>
+        </w:rPr>
+        <w:t xml:space="preserve">Foto3, </w:t>
+      </w:r>
+      <w:r>
+        <w:rPr>
+          <w:rFonts w:ascii="Times New Roman" w:hAnsi="Times New Roman" w:cs="Times New Roman"/>
+        </w:rPr>
+        <w:t>foto4</w:t>
+      </w:r>
+      <w:r>
+        <w:rPr>
+          <w:rFonts w:ascii="Times New Roman" w:hAnsi="Times New Roman" w:cs="Times New Roman"/>
+        </w:rPr>
+        <w:t>, foto5</w:t>
+      </w:r>
+    </w:p>
+    <w:p>
+      <w:pPr>
+        <w:pStyle w:val="Ttulo2"/>
+      </w:pPr>
+      <w:r>
+        <w:t>Nuestra Historia</w:t>
+      </w:r>
+    </w:p>
+    <w:p>
+      <w:pPr>
+        <w:rPr>
+          <w:rFonts w:ascii="Times New Roman" w:hAnsi="Times New Roman" w:cs="Times New Roman"/>
+        </w:rPr>
+      </w:pPr>
+      <w:r>
+        <w:rPr>
+          <w:rFonts w:ascii="Times New Roman" w:hAnsi="Times New Roman" w:cs="Times New Roman"/>
+        </w:rPr>
+        <w:t>Tierra, postes y trabajo colectivo</w:t>
+      </w:r>
+    </w:p>
+    <w:p>
+      <w:pPr>
+        <w:rPr>
+          <w:rFonts w:ascii="Times New Roman" w:hAnsi="Times New Roman" w:cs="Times New Roman"/>
+        </w:rPr>
+      </w:pPr>
+      <w:r>
+        <w:rPr>
+          <w:rFonts w:ascii="Times New Roman" w:hAnsi="Times New Roman" w:cs="Times New Roman"/>
+        </w:rPr>
+        <w:lastRenderedPageBreak/>
+        <w:t>Fotos: foto1</w:t>
+      </w:r>
+      <w:r>
+        <w:rPr>
+          <w:rFonts w:ascii="Times New Roman" w:hAnsi="Times New Roman" w:cs="Times New Roman"/>
+        </w:rPr>
+        <w:t xml:space="preserve"> y foto2</w:t>
+      </w:r>
+    </w:p>
+    <w:p>
+      <w:pPr>
+        <w:rPr>
+          <w:rFonts w:ascii="Times New Roman" w:hAnsi="Times New Roman" w:cs="Times New Roman"/>
+        </w:rPr>
+      </w:pPr>
+      <w:r>
+        <w:rPr>
+          <w:rFonts w:ascii="Times New Roman" w:hAnsi="Times New Roman" w:cs="Times New Roman"/>
+        </w:rPr>
+        <w:t>Video3</w:t>
       </w:r>
     </w:p>
     <w:p>
@@ -387,80 +340,63 @@
           <w:b/>
           <w:bCs/>
         </w:rPr>
-        <w:t>Año segundo</w:t>
-      </w:r>
-      <w:r>
-        <w:rPr>
-          <w:rFonts w:ascii="Times New Roman" w:hAnsi="Times New Roman" w:cs="Times New Roman"/>
-        </w:rPr>
-        <w:t>: julio de 2009 - julio de 2010</w:t>
-      </w:r>
-    </w:p>
-    <w:p>
-      <w:pPr>
-        <w:rPr>
-          <w:rFonts w:ascii="Times New Roman" w:hAnsi="Times New Roman" w:cs="Times New Roman"/>
-        </w:rPr>
-      </w:pPr>
-      <w:r>
-        <w:rPr>
-          <w:rFonts w:ascii="Times New Roman" w:hAnsi="Times New Roman" w:cs="Times New Roman"/>
-        </w:rPr>
-        <w:lastRenderedPageBreak/>
-        <w:t xml:space="preserve">Septiembre, 2009: Décimo tercer Encuentro Nacional de Artesanos. San Fernando-Buenos Aires. </w:t>
-      </w:r>
-    </w:p>
-    <w:p>
-      <w:pPr>
-        <w:rPr>
-          <w:rFonts w:ascii="Times New Roman" w:hAnsi="Times New Roman" w:cs="Times New Roman"/>
-        </w:rPr>
-      </w:pPr>
-      <w:r>
-        <w:rPr>
-          <w:rFonts w:ascii="Times New Roman" w:hAnsi="Times New Roman" w:cs="Times New Roman"/>
-        </w:rPr>
-        <w:t xml:space="preserve">Septiembre, 2009: Semana del turismo. </w:t>
-      </w:r>
-      <w:proofErr w:type="spellStart"/>
-      <w:r>
-        <w:rPr>
-          <w:rFonts w:ascii="Times New Roman" w:hAnsi="Times New Roman" w:cs="Times New Roman"/>
-        </w:rPr>
-        <w:t>Cineteatro</w:t>
-      </w:r>
-      <w:proofErr w:type="spellEnd"/>
-      <w:r>
-        <w:rPr>
-          <w:rFonts w:ascii="Times New Roman" w:hAnsi="Times New Roman" w:cs="Times New Roman"/>
-        </w:rPr>
-        <w:t xml:space="preserve"> Municipal de Cafayate</w:t>
-      </w:r>
-    </w:p>
-    <w:p>
-      <w:pPr>
-        <w:rPr>
-          <w:rFonts w:ascii="Times New Roman" w:hAnsi="Times New Roman" w:cs="Times New Roman"/>
-        </w:rPr>
-      </w:pPr>
-      <w:r>
-        <w:rPr>
-          <w:rFonts w:ascii="Times New Roman" w:hAnsi="Times New Roman" w:cs="Times New Roman"/>
-        </w:rPr>
-        <w:t>Marzo, 2010: Séptima Fiesta de la Vendimia. Finca las Nubes, Cafayate</w:t>
-      </w:r>
-    </w:p>
-    <w:p>
-      <w:pPr>
-        <w:rPr>
-          <w:rFonts w:ascii="Times New Roman" w:hAnsi="Times New Roman" w:cs="Times New Roman"/>
-        </w:rPr>
-      </w:pPr>
-      <w:r>
-        <w:rPr>
-          <w:rFonts w:ascii="Times New Roman" w:hAnsi="Times New Roman" w:cs="Times New Roman"/>
-        </w:rPr>
-        <w:t xml:space="preserve">Julio, 2010: Herencia Viva. Salón América, Salta. Secretaria de Turismo y Cultura, Salta </w:t>
+        <w:t>Año primero</w:t>
+      </w:r>
+      <w:r>
+        <w:rPr>
+          <w:rFonts w:ascii="Times New Roman" w:hAnsi="Times New Roman" w:cs="Times New Roman"/>
+        </w:rPr>
+        <w:t xml:space="preserve">: </w:t>
+      </w:r>
+      <w:r>
+        <w:rPr>
+          <w:rFonts w:ascii="Times New Roman" w:hAnsi="Times New Roman" w:cs="Times New Roman"/>
+        </w:rPr>
+        <w:t>j</w:t>
+      </w:r>
+      <w:r>
+        <w:rPr>
+          <w:rFonts w:ascii="Times New Roman" w:hAnsi="Times New Roman" w:cs="Times New Roman"/>
+        </w:rPr>
+        <w:t xml:space="preserve">ulio de 2008 </w:t>
+      </w:r>
+      <w:r>
+        <w:rPr>
+          <w:rFonts w:ascii="Times New Roman" w:hAnsi="Times New Roman" w:cs="Times New Roman"/>
+        </w:rPr>
+        <w:t>-</w:t>
+      </w:r>
+      <w:r>
+        <w:rPr>
+          <w:rFonts w:ascii="Times New Roman" w:hAnsi="Times New Roman" w:cs="Times New Roman"/>
+        </w:rPr>
+        <w:t xml:space="preserve"> julio del 2009</w:t>
+      </w:r>
+    </w:p>
+    <w:p>
+      <w:pPr>
+        <w:rPr>
+          <w:rFonts w:ascii="Times New Roman" w:hAnsi="Times New Roman" w:cs="Times New Roman"/>
+        </w:rPr>
+      </w:pPr>
+      <w:r>
+        <w:rPr>
+          <w:rFonts w:ascii="Times New Roman" w:hAnsi="Times New Roman" w:cs="Times New Roman"/>
+        </w:rPr>
+        <w:t>Agosto, 2008: Desfile de prendas artesanales en nuestro predio</w:t>
+      </w:r>
+    </w:p>
+    <w:p>
+      <w:pPr>
+        <w:rPr>
+          <w:rFonts w:ascii="Times New Roman" w:hAnsi="Times New Roman" w:cs="Times New Roman"/>
+        </w:rPr>
+      </w:pPr>
+      <w:r>
+        <w:rPr>
+          <w:rFonts w:ascii="Times New Roman" w:hAnsi="Times New Roman" w:cs="Times New Roman"/>
+        </w:rPr>
+        <w:t>Febrero, 2009: Fiesta de la Vendimia. Finca las Nubes (Cafayate)</w:t>
       </w:r>
     </w:p>
     <w:p>
@@ -475,6 +411,114 @@
           <w:b/>
           <w:bCs/>
         </w:rPr>
+        <w:t>Primer Aniversario</w:t>
+      </w:r>
+      <w:r>
+        <w:rPr>
+          <w:rFonts w:ascii="Times New Roman" w:hAnsi="Times New Roman" w:cs="Times New Roman"/>
+        </w:rPr>
+        <w:t>: Julio, 2009</w:t>
+      </w:r>
+    </w:p>
+    <w:p>
+      <w:pPr>
+        <w:rPr>
+          <w:rFonts w:ascii="Times New Roman" w:hAnsi="Times New Roman" w:cs="Times New Roman"/>
+        </w:rPr>
+      </w:pPr>
+      <w:r>
+        <w:rPr>
+          <w:rFonts w:ascii="Times New Roman" w:hAnsi="Times New Roman" w:cs="Times New Roman"/>
+          <w:b/>
+          <w:bCs/>
+        </w:rPr>
+        <w:t>Año segundo</w:t>
+      </w:r>
+      <w:r>
+        <w:rPr>
+          <w:rFonts w:ascii="Times New Roman" w:hAnsi="Times New Roman" w:cs="Times New Roman"/>
+        </w:rPr>
+        <w:t>: julio de 2009 - julio de 2010</w:t>
+      </w:r>
+    </w:p>
+    <w:p>
+      <w:pPr>
+        <w:rPr>
+          <w:rFonts w:ascii="Times New Roman" w:hAnsi="Times New Roman" w:cs="Times New Roman"/>
+        </w:rPr>
+      </w:pPr>
+      <w:r>
+        <w:rPr>
+          <w:rFonts w:ascii="Times New Roman" w:hAnsi="Times New Roman" w:cs="Times New Roman"/>
+        </w:rPr>
+        <w:t xml:space="preserve">Septiembre, 2009: Décimo tercer Encuentro Nacional de Artesanos. San Fernando-Buenos Aires. </w:t>
+      </w:r>
+    </w:p>
+    <w:p>
+      <w:pPr>
+        <w:rPr>
+          <w:rFonts w:ascii="Times New Roman" w:hAnsi="Times New Roman" w:cs="Times New Roman"/>
+        </w:rPr>
+      </w:pPr>
+      <w:r>
+        <w:rPr>
+          <w:rFonts w:ascii="Times New Roman" w:hAnsi="Times New Roman" w:cs="Times New Roman"/>
+        </w:rPr>
+        <w:t xml:space="preserve">Septiembre, 2009: Semana del turismo. </w:t>
+      </w:r>
+      <w:proofErr w:type="spellStart"/>
+      <w:r>
+        <w:rPr>
+          <w:rFonts w:ascii="Times New Roman" w:hAnsi="Times New Roman" w:cs="Times New Roman"/>
+        </w:rPr>
+        <w:t>Cineteatro</w:t>
+      </w:r>
+      <w:proofErr w:type="spellEnd"/>
+      <w:r>
+        <w:rPr>
+          <w:rFonts w:ascii="Times New Roman" w:hAnsi="Times New Roman" w:cs="Times New Roman"/>
+        </w:rPr>
+        <w:t xml:space="preserve"> Municipal de Cafayate</w:t>
+      </w:r>
+    </w:p>
+    <w:p>
+      <w:pPr>
+        <w:rPr>
+          <w:rFonts w:ascii="Times New Roman" w:hAnsi="Times New Roman" w:cs="Times New Roman"/>
+        </w:rPr>
+      </w:pPr>
+      <w:r>
+        <w:rPr>
+          <w:rFonts w:ascii="Times New Roman" w:hAnsi="Times New Roman" w:cs="Times New Roman"/>
+        </w:rPr>
+        <w:t>Marzo, 2010: Séptima Fiesta de la Vendimia. Finca las Nubes, Cafayate</w:t>
+      </w:r>
+    </w:p>
+    <w:p>
+      <w:pPr>
+        <w:rPr>
+          <w:rFonts w:ascii="Times New Roman" w:hAnsi="Times New Roman" w:cs="Times New Roman"/>
+        </w:rPr>
+      </w:pPr>
+      <w:r>
+        <w:rPr>
+          <w:rFonts w:ascii="Times New Roman" w:hAnsi="Times New Roman" w:cs="Times New Roman"/>
+        </w:rPr>
+        <w:t xml:space="preserve">Julio, 2010: Herencia Viva. Salón América, Salta. Secretaria de Turismo y Cultura, Salta </w:t>
+      </w:r>
+    </w:p>
+    <w:p>
+      <w:pPr>
+        <w:rPr>
+          <w:rFonts w:ascii="Times New Roman" w:hAnsi="Times New Roman" w:cs="Times New Roman"/>
+        </w:rPr>
+      </w:pPr>
+      <w:r>
+        <w:rPr>
+          <w:rFonts w:ascii="Times New Roman" w:hAnsi="Times New Roman" w:cs="Times New Roman"/>
+          <w:b/>
+          <w:bCs/>
+        </w:rPr>
         <w:t>Segundo Aniversario</w:t>
       </w:r>
       <w:r>
@@ -676,6 +720,7 @@
         <w:rPr>
           <w:rFonts w:ascii="Times New Roman" w:hAnsi="Times New Roman" w:cs="Times New Roman"/>
         </w:rPr>
+        <w:lastRenderedPageBreak/>
         <w:t xml:space="preserve">Junio, 2011: Feria de políticas sociales. Instituciones de la economía social. Ministerio de desarrollo social de la Nación. Plaza de </w:t>
       </w:r>
       <w:proofErr w:type="spellStart"/>
@@ -1159,6 +1204,7 @@
   <w:style w:type="paragraph" w:default="1" w:styleId="Normal">
     <w:name w:val="Normal"/>
     <w:qFormat/>
+    <w:rsid w:val="00B917D8"/>
   </w:style>
   <w:style w:type="paragraph" w:styleId="Ttulo1">
     <w:name w:val="heading 1"/>
@@ -1361,7 +1407,6 @@
   <w:style w:type="character" w:default="1" w:styleId="Fuentedeprrafopredeter">
     <w:name w:val="Default Paragraph Font"/>
     <w:uiPriority w:val="1"/>
-    <w:semiHidden/>
     <w:unhideWhenUsed/>
   </w:style>
   <w:style w:type="table" w:default="1" w:styleId="Tablanormal">

</xml_diff>